<commit_message>
Removendo: Rodapé com Data e Cidade
</commit_message>
<xml_diff>
--- a/assets/templates/bpc_bolsa_familia.docx
+++ b/assets/templates/bpc_bolsa_familia.docx
@@ -114,8 +114,6 @@
         </w:rPr>
         <w:t>, {{ nacionalidade_cliente }}, {{ estado_civil_cliente }}, inscrito(a) no CPF sob o nº {{ cpf_cliente }} e RG n° {{ rg_cliente }}, residente e domiciliado(a) na {{endereco_completo }}</w:t>
       </w:r>
-      <w:bookmarkStart w:id="0" w:name="_GoBack"/>
-      <w:bookmarkEnd w:id="0"/>
       <w:r>
         <w:rPr>
           <w:bCs/>
@@ -1237,7 +1235,7 @@
           <w:szCs w:val="24"/>
         </w:rPr>
       </w:pPr>
-      <w:bookmarkStart w:id="1" w:name="_Hlk217633236"/>
+      <w:bookmarkStart w:id="0" w:name="_Hlk217633236"/>
       <w:r>
         <w:rPr>
           <w:sz w:val="24"/>
@@ -1281,7 +1279,7 @@
         </w:rPr>
         <w:t>O perigo de dano se configura pelo fato de que, se continuar sem receber o benefício, a autora terá sua subsistência prejudicada, uma vez que o benefício tem caráter alimentar.</w:t>
       </w:r>
-      <w:bookmarkEnd w:id="1"/>
+      <w:bookmarkEnd w:id="0"/>
     </w:p>
     <w:p>
       <w:pPr>
@@ -1598,7 +1596,7 @@
         </w:rPr>
         <w:t xml:space="preserve">Inicialmente, insta informar que a parte Autora possui deficiência de longo prazo que limita significamente, o prejudicando fisicamente e socialmente em tarefas do dia a dia, deixando-o em desigualdade em face aos demais da sua idade. Nesse sentido, a parte Autora necessita acompanhamento médico e uso de medicações para controlar seu quadro </w:t>
       </w:r>
-      <w:bookmarkStart w:id="2" w:name="_Hlk198815936"/>
+      <w:bookmarkStart w:id="1" w:name="_Hlk198815936"/>
       <w:r>
         <w:rPr>
           <w:sz w:val="24"/>
@@ -1606,7 +1604,7 @@
         </w:rPr>
         <w:t>clínico</w:t>
       </w:r>
-      <w:bookmarkEnd w:id="2"/>
+      <w:bookmarkEnd w:id="1"/>
       <w:r>
         <w:rPr>
           <w:sz w:val="24"/>
@@ -1772,6 +1770,7 @@
         </w:rPr>
         <w:t xml:space="preserve">, a deficiência e o impedimento de longo prazo são decorrentes do diagnóstico de </w:t>
       </w:r>
+      <w:proofErr w:type="gramStart"/>
       <w:r>
         <w:rPr>
           <w:b/>
@@ -1791,7 +1790,18 @@
           <w:szCs w:val="24"/>
           <w:lang w:val="pt-BR" w:eastAsia="pt-BR"/>
         </w:rPr>
-        <w:t>diagnostico_cid</w:t>
+        <w:t>diagnostico</w:t>
+      </w:r>
+      <w:proofErr w:type="gramEnd"/>
+      <w:r>
+        <w:rPr>
+          <w:b/>
+          <w:bCs/>
+          <w:sz w:val="24"/>
+          <w:szCs w:val="24"/>
+          <w:lang w:val="pt-BR" w:eastAsia="pt-BR"/>
+        </w:rPr>
+        <w:t>_cid</w:t>
       </w:r>
       <w:proofErr w:type="spellEnd"/>
       <w:r>
@@ -1821,6 +1831,7 @@
           <w:lang w:val="pt-BR" w:eastAsia="pt-BR"/>
         </w:rPr>
       </w:pPr>
+      <w:proofErr w:type="gramStart"/>
       <w:r>
         <w:rPr>
           <w:sz w:val="24"/>
@@ -1836,7 +1847,16 @@
           <w:szCs w:val="24"/>
           <w:lang w:val="pt-BR" w:eastAsia="pt-BR"/>
         </w:rPr>
-        <w:t>detalhes_laudo</w:t>
+        <w:t>detalhes</w:t>
+      </w:r>
+      <w:proofErr w:type="gramEnd"/>
+      <w:r>
+        <w:rPr>
+          <w:sz w:val="24"/>
+          <w:szCs w:val="24"/>
+          <w:lang w:val="pt-BR" w:eastAsia="pt-BR"/>
+        </w:rPr>
+        <w:t>_laudo</w:t>
       </w:r>
       <w:proofErr w:type="spellEnd"/>
       <w:r>
@@ -5519,13 +5539,58 @@
           <w:szCs w:val="24"/>
         </w:rPr>
       </w:pPr>
-      <w:r>
-        <w:rPr>
-          <w:sz w:val="24"/>
-          <w:szCs w:val="24"/>
-        </w:rPr>
-        <w:t>{{ local_data }}</w:t>
-      </w:r>
+      <w:bookmarkStart w:id="2" w:name="_GoBack"/>
+      <w:r>
+        <w:rPr>
+          <w:sz w:val="24"/>
+          <w:szCs w:val="24"/>
+        </w:rPr>
+        <w:t xml:space="preserve">Guaraciaba do Norte – CE, </w:t>
+      </w:r>
+      <w:r>
+        <w:rPr>
+          <w:sz w:val="24"/>
+          <w:szCs w:val="24"/>
+        </w:rPr>
+        <w:fldChar w:fldCharType="begin"/>
+      </w:r>
+      <w:r>
+        <w:rPr>
+          <w:sz w:val="24"/>
+          <w:szCs w:val="24"/>
+        </w:rPr>
+        <w:instrText xml:space="preserve"> TIME \@ "d' de 'MMMM' de 'yyyy" </w:instrText>
+      </w:r>
+      <w:r>
+        <w:rPr>
+          <w:sz w:val="24"/>
+          <w:szCs w:val="24"/>
+        </w:rPr>
+        <w:fldChar w:fldCharType="separate"/>
+      </w:r>
+      <w:r>
+        <w:rPr>
+          <w:noProof/>
+          <w:sz w:val="24"/>
+          <w:szCs w:val="24"/>
+        </w:rPr>
+        <w:t>29 de julho de 2026</w:t>
+      </w:r>
+      <w:r>
+        <w:rPr>
+          <w:sz w:val="24"/>
+          <w:szCs w:val="24"/>
+        </w:rPr>
+        <w:fldChar w:fldCharType="end"/>
+      </w:r>
+      <w:r>
+        <w:rPr>
+          <w:sz w:val="24"/>
+          <w:szCs w:val="24"/>
+        </w:rPr>
+        <w:t>.</w:t>
+      </w:r>
+      <w:bookmarkEnd w:id="2"/>
     </w:p>
     <w:p>
       <w:pPr>
@@ -5722,7 +5787,7 @@
             </wp:anchor>
           </w:drawing>
         </mc:Choice>
-        <mc:Fallback xmlns:w16sdtfl="http://schemas.microsoft.com/office/word/2024/wordml/sdtformatlock" xmlns:w16sdtdh="http://schemas.microsoft.com/office/word/2020/wordml/sdtdatahash" xmlns:w16du="http://schemas.microsoft.com/office/word/2023/wordml/word16du" xmlns:oel="http://schemas.microsoft.com/office/2019/extlst">
+        <mc:Fallback xmlns:oel="http://schemas.microsoft.com/office/2019/extlst" xmlns:w16du="http://schemas.microsoft.com/office/word/2023/wordml/word16du" xmlns:w16sdtdh="http://schemas.microsoft.com/office/word/2020/wordml/sdtdatahash" xmlns:w16sdtfl="http://schemas.microsoft.com/office/word/2024/wordml/sdtformatlock">
           <w:pict>
             <v:shape w14:anchorId="3BCF6105" id="Forma Livre: Forma 13" o:spid="_x0000_s1026" style="position:absolute;margin-left:97.1pt;margin-top:24.7pt;width:370.9pt;height:.1pt;z-index:-251653120;visibility:visible;mso-wrap-style:square;mso-width-percent:0;mso-height-percent:0;mso-wrap-distance-left:0;mso-wrap-distance-top:0;mso-wrap-distance-right:0;mso-wrap-distance-bottom:0;mso-position-horizontal:absolute;mso-position-horizontal-relative:page;mso-position-vertical:absolute;mso-position-vertical-relative:text;mso-width-percent:0;mso-height-percent:0;mso-width-relative:page;mso-height-relative:page;v-text-anchor:top" coordsize="4710430,1270" o:gfxdata="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" path="m,l4709804,e" filled="f" strokeweight=".40283mm">
               <v:path arrowok="t" o:connecttype="custom" o:connectlocs="0,0;4709804,0" o:connectangles="0,0"/>
@@ -6091,7 +6156,7 @@
             </wp:anchor>
           </w:drawing>
         </mc:Choice>
-        <mc:Fallback xmlns:w16sdtfl="http://schemas.microsoft.com/office/word/2024/wordml/sdtformatlock" xmlns:w16sdtdh="http://schemas.microsoft.com/office/word/2020/wordml/sdtdatahash" xmlns:w16du="http://schemas.microsoft.com/office/word/2023/wordml/word16du" xmlns:oel="http://schemas.microsoft.com/office/2019/extlst">
+        <mc:Fallback xmlns:oel="http://schemas.microsoft.com/office/2019/extlst" xmlns:w16du="http://schemas.microsoft.com/office/word/2023/wordml/word16du" xmlns:w16sdtdh="http://schemas.microsoft.com/office/word/2020/wordml/sdtdatahash" xmlns:w16sdtfl="http://schemas.microsoft.com/office/word/2024/wordml/sdtformatlock">
           <w:pict>
             <v:shape w14:anchorId="734A0437" id="Forma Livre: Forma 3" o:spid="_x0000_s1026" style="position:absolute;margin-left:97.1pt;margin-top:24.7pt;width:370.9pt;height:.1pt;z-index:-251655168;visibility:visible;mso-wrap-style:square;mso-width-percent:0;mso-height-percent:0;mso-wrap-distance-left:0;mso-wrap-distance-top:0;mso-wrap-distance-right:0;mso-wrap-distance-bottom:0;mso-position-horizontal:absolute;mso-position-horizontal-relative:page;mso-position-vertical:absolute;mso-position-vertical-relative:text;mso-width-percent:0;mso-height-percent:0;mso-width-relative:page;mso-height-relative:page;v-text-anchor:top" coordsize="4710430,1270" o:gfxdata="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" path="m,l4709804,e" filled="f" strokeweight=".40283mm">
               <v:path arrowok="t" o:connecttype="custom" o:connectlocs="0,0;4709804,0" o:connectangles="0,0"/>
@@ -10025,7 +10090,7 @@
 </file>
 
 <file path=customXml/itemProps1.xml><?xml version="1.0" encoding="utf-8"?>
-<ds:datastoreItem xmlns:ds="http://schemas.openxmlformats.org/officeDocument/2006/customXml" ds:itemID="{DE654039-4191-47BC-AF3E-3C9FBDA8E655}">
+<ds:datastoreItem xmlns:ds="http://schemas.openxmlformats.org/officeDocument/2006/customXml" ds:itemID="{BCF698D8-FDA7-4FB3-8517-F3D9FC45C269}">
   <ds:schemaRefs>
     <ds:schemaRef ds:uri="http://schemas.openxmlformats.org/officeDocument/2006/bibliography"/>
   </ds:schemaRefs>

</xml_diff>

<commit_message>
Adicionando: Novo Modelo e Funcionalidades
</commit_message>
<xml_diff>
--- a/assets/templates/bpc_bolsa_familia.docx
+++ b/assets/templates/bpc_bolsa_familia.docx
@@ -4913,8 +4913,6 @@
         </w:rPr>
       </w:pPr>
     </w:p>
-    <w:bookmarkStart w:id="2" w:name="_GoBack"/>
-    <w:bookmarkEnd w:id="2"/>
     <w:p>
       <w:pPr>
         <w:spacing w:line="360" w:lineRule="auto"/>
@@ -5738,7 +5736,28 @@
           <w:sz w:val="24"/>
           <w:szCs w:val="24"/>
         </w:rPr>
-        <w:t xml:space="preserve">OAB/CE Nº </w:t>
+        <w:t>OAB/</w:t>
+      </w:r>
+      <w:r>
+        <w:rPr>
+          <w:b/>
+          <w:bCs/>
+          <w:sz w:val="24"/>
+          <w:szCs w:val="24"/>
+          <w:highlight w:val="yellow"/>
+        </w:rPr>
+        <w:t>CE</w:t>
+      </w:r>
+      <w:bookmarkStart w:id="2" w:name="_GoBack"/>
+      <w:bookmarkEnd w:id="2"/>
+      <w:r>
+        <w:rPr>
+          <w:b/>
+          <w:bCs/>
+          <w:sz w:val="24"/>
+          <w:szCs w:val="24"/>
+        </w:rPr>
+        <w:t xml:space="preserve"> Nº </w:t>
       </w:r>
       <w:r>
         <w:rPr>
@@ -5892,7 +5911,7 @@
             </wp:anchor>
           </w:drawing>
         </mc:Choice>
-        <mc:Fallback xmlns:oel="http://schemas.microsoft.com/office/2019/extlst" xmlns:w16du="http://schemas.microsoft.com/office/word/2023/wordml/word16du" xmlns:w16sdtdh="http://schemas.microsoft.com/office/word/2020/wordml/sdtdatahash" xmlns:w16sdtfl="http://schemas.microsoft.com/office/word/2024/wordml/sdtformatlock">
+        <mc:Fallback xmlns:w16sdtfl="http://schemas.microsoft.com/office/word/2024/wordml/sdtformatlock" xmlns:w16sdtdh="http://schemas.microsoft.com/office/word/2020/wordml/sdtdatahash" xmlns:w16du="http://schemas.microsoft.com/office/word/2023/wordml/word16du" xmlns:oel="http://schemas.microsoft.com/office/2019/extlst">
           <w:pict>
             <v:shape w14:anchorId="3BCF6105" id="Forma Livre: Forma 13" o:spid="_x0000_s1026" style="position:absolute;margin-left:97.1pt;margin-top:24.7pt;width:370.9pt;height:.1pt;z-index:-251653120;visibility:visible;mso-wrap-style:square;mso-width-percent:0;mso-height-percent:0;mso-wrap-distance-left:0;mso-wrap-distance-top:0;mso-wrap-distance-right:0;mso-wrap-distance-bottom:0;mso-position-horizontal:absolute;mso-position-horizontal-relative:page;mso-position-vertical:absolute;mso-position-vertical-relative:text;mso-width-percent:0;mso-height-percent:0;mso-width-relative:page;mso-height-relative:page;v-text-anchor:top" coordsize="4710430,1270" o:gfxdata="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" path="m,l4709804,e" filled="f" strokeweight=".40283mm">
               <v:path arrowok="t" o:connecttype="custom" o:connectlocs="0,0;4709804,0" o:connectangles="0,0"/>
@@ -6261,7 +6280,7 @@
             </wp:anchor>
           </w:drawing>
         </mc:Choice>
-        <mc:Fallback xmlns:oel="http://schemas.microsoft.com/office/2019/extlst" xmlns:w16du="http://schemas.microsoft.com/office/word/2023/wordml/word16du" xmlns:w16sdtdh="http://schemas.microsoft.com/office/word/2020/wordml/sdtdatahash" xmlns:w16sdtfl="http://schemas.microsoft.com/office/word/2024/wordml/sdtformatlock">
+        <mc:Fallback xmlns:w16sdtfl="http://schemas.microsoft.com/office/word/2024/wordml/sdtformatlock" xmlns:w16sdtdh="http://schemas.microsoft.com/office/word/2020/wordml/sdtdatahash" xmlns:w16du="http://schemas.microsoft.com/office/word/2023/wordml/word16du" xmlns:oel="http://schemas.microsoft.com/office/2019/extlst">
           <w:pict>
             <v:shape w14:anchorId="734A0437" id="Forma Livre: Forma 3" o:spid="_x0000_s1026" style="position:absolute;margin-left:97.1pt;margin-top:24.7pt;width:370.9pt;height:.1pt;z-index:-251655168;visibility:visible;mso-wrap-style:square;mso-width-percent:0;mso-height-percent:0;mso-wrap-distance-left:0;mso-wrap-distance-top:0;mso-wrap-distance-right:0;mso-wrap-distance-bottom:0;mso-position-horizontal:absolute;mso-position-horizontal-relative:page;mso-position-vertical:absolute;mso-position-vertical-relative:text;mso-width-percent:0;mso-height-percent:0;mso-width-relative:page;mso-height-relative:page;v-text-anchor:top" coordsize="4710430,1270" o:gfxdata="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" path="m,l4709804,e" filled="f" strokeweight=".40283mm">
               <v:path arrowok="t" o:connecttype="custom" o:connectlocs="0,0;4709804,0" o:connectangles="0,0"/>
@@ -10195,7 +10214,7 @@
 </file>
 
 <file path=customXml/itemProps1.xml><?xml version="1.0" encoding="utf-8"?>
-<ds:datastoreItem xmlns:ds="http://schemas.openxmlformats.org/officeDocument/2006/customXml" ds:itemID="{3993C2CC-D593-43AF-B4D9-C647EE1008E2}">
+<ds:datastoreItem xmlns:ds="http://schemas.openxmlformats.org/officeDocument/2006/customXml" ds:itemID="{6E01BE1B-9316-4635-83B3-ECB90AA1FC24}">
   <ds:schemaRefs>
     <ds:schemaRef ds:uri="http://schemas.openxmlformats.org/officeDocument/2006/bibliography"/>
   </ds:schemaRefs>

</xml_diff>